<commit_message>
login & register heroui
</commit_message>
<xml_diff>
--- a/Dokumentacio/Graphlet Dokumentáció.docx
+++ b/Dokumentacio/Graphlet Dokumentáció.docx
@@ -52,9 +52,11 @@
           <w:numId w:val="1"/>
         </w:numPr>
       </w:pPr>
+      <w:proofErr w:type="spellStart"/>
       <w:r>
         <w:t>Implementation</w:t>
       </w:r>
+      <w:proofErr w:type="spellEnd"/>
     </w:p>
     <w:p>
       <w:r>
@@ -62,8 +64,13 @@
       </w:r>
     </w:p>
     <w:p>
-      <w:r>
-        <w:t>felhasználo doksi</w:t>
+      <w:proofErr w:type="spellStart"/>
+      <w:r>
+        <w:t>felhasználo</w:t>
+      </w:r>
+      <w:proofErr w:type="spellEnd"/>
+      <w:r>
+        <w:t xml:space="preserve"> doksi</w:t>
       </w:r>
     </w:p>
     <w:p>
@@ -92,7 +99,15 @@
     </w:p>
     <w:p>
       <w:r>
-        <w:t>Irodalom Jegyzék (Szoftver Biógráfia) és Mellékletek</w:t>
+        <w:t xml:space="preserve">Irodalom Jegyzék (Szoftver </w:t>
+      </w:r>
+      <w:proofErr w:type="spellStart"/>
+      <w:r>
+        <w:t>Biógráfia</w:t>
+      </w:r>
+      <w:proofErr w:type="spellEnd"/>
+      <w:r>
+        <w:t>) és Mellékletek</w:t>
       </w:r>
     </w:p>
     <w:p/>
@@ -122,7 +137,23 @@
         </w:numPr>
       </w:pPr>
       <w:r>
-        <w:t>Baloldali Margo 4cm, minden mas 2.5cm</w:t>
+        <w:t xml:space="preserve">Baloldali </w:t>
+      </w:r>
+      <w:proofErr w:type="spellStart"/>
+      <w:r>
+        <w:t>Margo</w:t>
+      </w:r>
+      <w:proofErr w:type="spellEnd"/>
+      <w:r>
+        <w:t xml:space="preserve"> 4cm, minden </w:t>
+      </w:r>
+      <w:proofErr w:type="spellStart"/>
+      <w:r>
+        <w:t>mas</w:t>
+      </w:r>
+      <w:proofErr w:type="spellEnd"/>
+      <w:r>
+        <w:t xml:space="preserve"> 2.5cm</w:t>
       </w:r>
     </w:p>
     <w:p>
@@ -133,8 +164,37 @@
           <w:numId w:val="1"/>
         </w:numPr>
       </w:pPr>
-      <w:r>
-        <w:t>Folyoszoveg(bekkezdések) : 12Pontos talpas betütipus (Times New Roman ajanlott)</w:t>
+      <w:proofErr w:type="spellStart"/>
+      <w:r>
+        <w:t>Folyoszoveg</w:t>
+      </w:r>
+      <w:proofErr w:type="spellEnd"/>
+      <w:r>
+        <w:t>(</w:t>
+      </w:r>
+      <w:proofErr w:type="spellStart"/>
+      <w:r>
+        <w:t>bekkezdések</w:t>
+      </w:r>
+      <w:proofErr w:type="spellEnd"/>
+      <w:r>
+        <w:t xml:space="preserve">) : 12Pontos talpas </w:t>
+      </w:r>
+      <w:proofErr w:type="spellStart"/>
+      <w:r>
+        <w:t>betütipus</w:t>
+      </w:r>
+      <w:proofErr w:type="spellEnd"/>
+      <w:r>
+        <w:t xml:space="preserve"> (Times New Roman </w:t>
+      </w:r>
+      <w:proofErr w:type="spellStart"/>
+      <w:r>
+        <w:t>ajanlott</w:t>
+      </w:r>
+      <w:proofErr w:type="spellEnd"/>
+      <w:r>
+        <w:t>)</w:t>
       </w:r>
     </w:p>
     <w:p>
@@ -169,8 +229,21 @@
           <w:numId w:val="1"/>
         </w:numPr>
       </w:pPr>
-      <w:r>
-        <w:t>Elsö sorok behuzása bekezdésnél 0.7 cm</w:t>
+      <w:proofErr w:type="spellStart"/>
+      <w:r>
+        <w:t>Elsö</w:t>
+      </w:r>
+      <w:proofErr w:type="spellEnd"/>
+      <w:r>
+        <w:t xml:space="preserve"> sorok </w:t>
+      </w:r>
+      <w:proofErr w:type="spellStart"/>
+      <w:r>
+        <w:t>behuzása</w:t>
+      </w:r>
+      <w:proofErr w:type="spellEnd"/>
+      <w:r>
+        <w:t xml:space="preserve"> bekezdésnél 0.7 cm</w:t>
       </w:r>
     </w:p>
     <w:p>
@@ -181,8 +254,13 @@
           <w:numId w:val="1"/>
         </w:numPr>
       </w:pPr>
-      <w:r>
-        <w:t>söveg: Automatikus elválasztás ON</w:t>
+      <w:proofErr w:type="spellStart"/>
+      <w:r>
+        <w:t>söveg</w:t>
+      </w:r>
+      <w:proofErr w:type="spellEnd"/>
+      <w:r>
+        <w:t>: Automatikus elválasztás ON</w:t>
       </w:r>
     </w:p>
     <w:p>
@@ -206,10 +284,63 @@
         </w:numPr>
       </w:pPr>
       <w:r>
-        <w:t>Cím sorok: 3 cimsor, elso, második, harmadik szintü cimsor</w:t>
-      </w:r>
-      <w:r>
-        <w:t>: elötte 18 pont terkoz, utana 12</w:t>
+        <w:t xml:space="preserve">Cím sorok: 3 </w:t>
+      </w:r>
+      <w:proofErr w:type="spellStart"/>
+      <w:r>
+        <w:t>cimsor</w:t>
+      </w:r>
+      <w:proofErr w:type="spellEnd"/>
+      <w:r>
+        <w:t xml:space="preserve">, </w:t>
+      </w:r>
+      <w:proofErr w:type="spellStart"/>
+      <w:r>
+        <w:t>elso</w:t>
+      </w:r>
+      <w:proofErr w:type="spellEnd"/>
+      <w:r>
+        <w:t xml:space="preserve">, második, harmadik </w:t>
+      </w:r>
+      <w:proofErr w:type="spellStart"/>
+      <w:r>
+        <w:t>szintü</w:t>
+      </w:r>
+      <w:proofErr w:type="spellEnd"/>
+      <w:r>
+        <w:t xml:space="preserve"> </w:t>
+      </w:r>
+      <w:proofErr w:type="spellStart"/>
+      <w:r>
+        <w:t>cimsor</w:t>
+      </w:r>
+      <w:proofErr w:type="spellEnd"/>
+      <w:r>
+        <w:t xml:space="preserve">: </w:t>
+      </w:r>
+      <w:proofErr w:type="spellStart"/>
+      <w:r>
+        <w:t>elötte</w:t>
+      </w:r>
+      <w:proofErr w:type="spellEnd"/>
+      <w:r>
+        <w:t xml:space="preserve"> 18 pont </w:t>
+      </w:r>
+      <w:proofErr w:type="spellStart"/>
+      <w:r>
+        <w:t>terkoz</w:t>
+      </w:r>
+      <w:proofErr w:type="spellEnd"/>
+      <w:r>
+        <w:t xml:space="preserve">, </w:t>
+      </w:r>
+      <w:proofErr w:type="spellStart"/>
+      <w:r>
+        <w:t>utana</w:t>
+      </w:r>
+      <w:proofErr w:type="spellEnd"/>
+      <w:r>
+        <w:t xml:space="preserve"> 12</w:t>
       </w:r>
     </w:p>
     <w:p>
@@ -220,9 +351,35 @@
           <w:numId w:val="1"/>
         </w:numPr>
       </w:pPr>
-      <w:r>
-        <w:t>elso szintu: 16 betumeret felkover</w:t>
-      </w:r>
+      <w:proofErr w:type="spellStart"/>
+      <w:r>
+        <w:t>elso</w:t>
+      </w:r>
+      <w:proofErr w:type="spellEnd"/>
+      <w:r>
+        <w:t xml:space="preserve"> </w:t>
+      </w:r>
+      <w:proofErr w:type="spellStart"/>
+      <w:r>
+        <w:t>szintu</w:t>
+      </w:r>
+      <w:proofErr w:type="spellEnd"/>
+      <w:r>
+        <w:t xml:space="preserve">: 16 </w:t>
+      </w:r>
+      <w:proofErr w:type="spellStart"/>
+      <w:r>
+        <w:t>betumeret</w:t>
+      </w:r>
+      <w:proofErr w:type="spellEnd"/>
+      <w:r>
+        <w:t xml:space="preserve"> </w:t>
+      </w:r>
+      <w:proofErr w:type="spellStart"/>
+      <w:r>
+        <w:t>felkover</w:t>
+      </w:r>
+      <w:proofErr w:type="spellEnd"/>
       <w:r>
         <w:t xml:space="preserve"> </w:t>
       </w:r>
@@ -235,15 +392,22 @@
           <w:numId w:val="1"/>
         </w:numPr>
       </w:pPr>
-      <w:r>
-        <w:t>masodik: 14 pontos</w:t>
+      <w:proofErr w:type="spellStart"/>
+      <w:r>
+        <w:t>masodik</w:t>
+      </w:r>
+      <w:proofErr w:type="spellEnd"/>
+      <w:r>
+        <w:t>: 14 pontos</w:t>
       </w:r>
       <w:r>
         <w:t xml:space="preserve"> </w:t>
       </w:r>
+      <w:proofErr w:type="spellStart"/>
       <w:r>
         <w:t>felkover</w:t>
       </w:r>
+      <w:proofErr w:type="spellEnd"/>
     </w:p>
     <w:p>
       <w:pPr>
@@ -259,9 +423,11 @@
       <w:r>
         <w:t xml:space="preserve"> </w:t>
       </w:r>
+      <w:proofErr w:type="spellStart"/>
       <w:r>
         <w:t>felkover</w:t>
       </w:r>
+      <w:proofErr w:type="spellEnd"/>
     </w:p>
     <w:p>
       <w:pPr>
@@ -272,7 +438,15 @@
         </w:numPr>
       </w:pPr>
       <w:r>
-        <w:t>Képhez, Ábrához, Diagramhoz kell leirás és számozás.</w:t>
+        <w:t xml:space="preserve">Képhez, Ábrához, Diagramhoz kell </w:t>
+      </w:r>
+      <w:proofErr w:type="spellStart"/>
+      <w:r>
+        <w:t>leirás</w:t>
+      </w:r>
+      <w:proofErr w:type="spellEnd"/>
+      <w:r>
+        <w:t xml:space="preserve"> és számozás.</w:t>
       </w:r>
     </w:p>
     <w:p>
@@ -284,7 +458,15 @@
         </w:numPr>
       </w:pPr>
       <w:r>
-        <w:t>Matek és Logikai Képletek Képlet szerkesztövel legyen ábrázolva.</w:t>
+        <w:t xml:space="preserve">Matek és Logikai Képletek Képlet </w:t>
+      </w:r>
+      <w:proofErr w:type="spellStart"/>
+      <w:r>
+        <w:t>szerkesztövel</w:t>
+      </w:r>
+      <w:proofErr w:type="spellEnd"/>
+      <w:r>
+        <w:t xml:space="preserve"> legyen ábrázolva.</w:t>
       </w:r>
     </w:p>
     <w:p>
@@ -296,7 +478,15 @@
         </w:numPr>
       </w:pPr>
       <w:r>
-        <w:t>Ne legyen tul sok forrás kód benne, és Szövegdobozban, formázva.</w:t>
+        <w:t xml:space="preserve">Ne legyen </w:t>
+      </w:r>
+      <w:proofErr w:type="spellStart"/>
+      <w:r>
+        <w:t>tul</w:t>
+      </w:r>
+      <w:proofErr w:type="spellEnd"/>
+      <w:r>
+        <w:t xml:space="preserve"> sok forrás kód benne, és Szövegdobozban, formázva.</w:t>
       </w:r>
     </w:p>
     <w:p>
@@ -311,7 +501,15 @@
         </w:rPr>
       </w:pPr>
       <w:r>
-        <w:t>Terjedelem: min 40 oldal. felsö határ nincs, de ne legyen több mint 90 oldal.</w:t>
+        <w:t xml:space="preserve">Terjedelem: min 40 oldal. </w:t>
+      </w:r>
+      <w:proofErr w:type="spellStart"/>
+      <w:r>
+        <w:t>felsö</w:t>
+      </w:r>
+      <w:proofErr w:type="spellEnd"/>
+      <w:r>
+        <w:t xml:space="preserve"> határ nincs, de ne legyen több mint 90 oldal.</w:t>
       </w:r>
       <w:r>
         <w:t xml:space="preserve"> </w:t>
@@ -1284,21 +1482,7 @@
             <w:rStyle w:val="Hiperhivatkozs"/>
             <w:noProof/>
           </w:rPr>
-          <w:t>Kód szi</w:t>
-        </w:r>
-        <w:r>
-          <w:rPr>
-            <w:rStyle w:val="Hiperhivatkozs"/>
-            <w:noProof/>
-          </w:rPr>
-          <w:t>n</w:t>
-        </w:r>
-        <w:r>
-          <w:rPr>
-            <w:rStyle w:val="Hiperhivatkozs"/>
-            <w:noProof/>
-          </w:rPr>
-          <w:t>ten</w:t>
+          <w:t>Kód szinten</w:t>
         </w:r>
         <w:r>
           <w:rPr>
@@ -2185,8 +2369,13 @@
       <w:pPr>
         <w:pStyle w:val="Graphlet-normal"/>
       </w:pPr>
-      <w:r>
-        <w:t>normal text</w:t>
+      <w:proofErr w:type="spellStart"/>
+      <w:r>
+        <w:t>normal</w:t>
+      </w:r>
+      <w:proofErr w:type="spellEnd"/>
+      <w:r>
+        <w:t xml:space="preserve"> text</w:t>
       </w:r>
     </w:p>
     <w:p>
@@ -2217,21 +2406,37 @@
           <w:sz w:val="24"/>
           <w:szCs w:val="24"/>
         </w:rPr>
-        <w:t>csinálj majd, valami db sectiont, hogy teljenek az oldalak</w:t>
-      </w:r>
-    </w:p>
-    <w:p>
-      <w:pPr>
+        <w:t xml:space="preserve">csinálj majd, valami db </w:t>
+      </w:r>
+      <w:proofErr w:type="spellStart"/>
+      <w:r>
         <w:rPr>
           <w:sz w:val="24"/>
           <w:szCs w:val="24"/>
         </w:rPr>
-      </w:pPr>
+        <w:t>sectiont</w:t>
+      </w:r>
+      <w:proofErr w:type="spellEnd"/>
       <w:r>
         <w:rPr>
           <w:sz w:val="24"/>
           <w:szCs w:val="24"/>
         </w:rPr>
+        <w:t>, hogy teljenek az oldalak</w:t>
+      </w:r>
+    </w:p>
+    <w:p>
+      <w:pPr>
+        <w:rPr>
+          <w:sz w:val="24"/>
+          <w:szCs w:val="24"/>
+        </w:rPr>
+      </w:pPr>
+      <w:r>
+        <w:rPr>
+          <w:sz w:val="24"/>
+          <w:szCs w:val="24"/>
+        </w:rPr>
         <w:br w:type="page"/>
       </w:r>
     </w:p>
@@ -2270,9 +2475,107 @@
       <w:pPr>
         <w:pStyle w:val="Graphlet-normal"/>
       </w:pPr>
-      <w:r>
-        <w:t>normal text looks like this lorem32dioéfjg mkjblfkdmb boődn aodfőmboőiareúm adifoőúb nmieropőú bfiobőa bfoőiba ndofaiőáb mortőaű inm</w:t>
-      </w:r>
+      <w:proofErr w:type="spellStart"/>
+      <w:r>
+        <w:t>normal</w:t>
+      </w:r>
+      <w:proofErr w:type="spellEnd"/>
+      <w:r>
+        <w:t xml:space="preserve"> text </w:t>
+      </w:r>
+      <w:proofErr w:type="spellStart"/>
+      <w:r>
+        <w:t>looks</w:t>
+      </w:r>
+      <w:proofErr w:type="spellEnd"/>
+      <w:r>
+        <w:t xml:space="preserve"> like </w:t>
+      </w:r>
+      <w:proofErr w:type="spellStart"/>
+      <w:r>
+        <w:t>this</w:t>
+      </w:r>
+      <w:proofErr w:type="spellEnd"/>
+      <w:r>
+        <w:t xml:space="preserve"> lorem32dioéfjg </w:t>
+      </w:r>
+      <w:proofErr w:type="spellStart"/>
+      <w:r>
+        <w:t>mkjblfkdmb</w:t>
+      </w:r>
+      <w:proofErr w:type="spellEnd"/>
+      <w:r>
+        <w:t xml:space="preserve"> </w:t>
+      </w:r>
+      <w:proofErr w:type="spellStart"/>
+      <w:r>
+        <w:t>boődn</w:t>
+      </w:r>
+      <w:proofErr w:type="spellEnd"/>
+      <w:r>
+        <w:t xml:space="preserve"> </w:t>
+      </w:r>
+      <w:proofErr w:type="spellStart"/>
+      <w:r>
+        <w:t>aodfőmboőiareúm</w:t>
+      </w:r>
+      <w:proofErr w:type="spellEnd"/>
+      <w:r>
+        <w:t xml:space="preserve"> </w:t>
+      </w:r>
+      <w:proofErr w:type="spellStart"/>
+      <w:r>
+        <w:t>adifoőúb</w:t>
+      </w:r>
+      <w:proofErr w:type="spellEnd"/>
+      <w:r>
+        <w:t xml:space="preserve"> </w:t>
+      </w:r>
+      <w:proofErr w:type="spellStart"/>
+      <w:r>
+        <w:t>nmieropőú</w:t>
+      </w:r>
+      <w:proofErr w:type="spellEnd"/>
+      <w:r>
+        <w:t xml:space="preserve"> </w:t>
+      </w:r>
+      <w:proofErr w:type="spellStart"/>
+      <w:r>
+        <w:t>bfiobőa</w:t>
+      </w:r>
+      <w:proofErr w:type="spellEnd"/>
+      <w:r>
+        <w:t xml:space="preserve"> </w:t>
+      </w:r>
+      <w:proofErr w:type="spellStart"/>
+      <w:r>
+        <w:t>bfoőiba</w:t>
+      </w:r>
+      <w:proofErr w:type="spellEnd"/>
+      <w:r>
+        <w:t xml:space="preserve"> </w:t>
+      </w:r>
+      <w:proofErr w:type="spellStart"/>
+      <w:r>
+        <w:t>ndofaiőáb</w:t>
+      </w:r>
+      <w:proofErr w:type="spellEnd"/>
+      <w:r>
+        <w:t xml:space="preserve"> </w:t>
+      </w:r>
+      <w:proofErr w:type="spellStart"/>
+      <w:r>
+        <w:t>mortőaű</w:t>
+      </w:r>
+      <w:proofErr w:type="spellEnd"/>
+      <w:r>
+        <w:t xml:space="preserve"> </w:t>
+      </w:r>
+      <w:proofErr w:type="spellStart"/>
+      <w:r>
+        <w:t>inm</w:t>
+      </w:r>
+      <w:proofErr w:type="spellEnd"/>
     </w:p>
     <w:p>
       <w:pPr>
@@ -2324,24 +2627,14 @@
         <w:t xml:space="preserve">A Graphlet felhasználó felülete JavaScript nyelven íródott. Azon belül a </w:t>
       </w:r>
       <w:hyperlink r:id="rId8" w:history="1">
+        <w:proofErr w:type="spellStart"/>
         <w:r>
           <w:rPr>
             <w:rStyle w:val="Hiperhivatkozs"/>
           </w:rPr>
-          <w:t>Re</w:t>
-        </w:r>
-        <w:r>
-          <w:rPr>
-            <w:rStyle w:val="Hiperhivatkozs"/>
-          </w:rPr>
-          <w:t>a</w:t>
-        </w:r>
-        <w:r>
-          <w:rPr>
-            <w:rStyle w:val="Hiperhivatkozs"/>
-          </w:rPr>
-          <w:t>ct</w:t>
-        </w:r>
+          <w:t>React</w:t>
+        </w:r>
+        <w:proofErr w:type="spellEnd"/>
       </w:hyperlink>
       <w:r>
         <w:t xml:space="preserve"> könyvtár segítségével.</w:t>
@@ -2402,7 +2695,21 @@
         <w:rPr>
           <w:color w:val="C45911" w:themeColor="accent2" w:themeShade="BF"/>
         </w:rPr>
-        <w:t xml:space="preserve">„src” </w:t>
+        <w:t>„</w:t>
+      </w:r>
+      <w:proofErr w:type="spellStart"/>
+      <w:r>
+        <w:rPr>
+          <w:color w:val="C45911" w:themeColor="accent2" w:themeShade="BF"/>
+        </w:rPr>
+        <w:t>src</w:t>
+      </w:r>
+      <w:proofErr w:type="spellEnd"/>
+      <w:r>
+        <w:rPr>
+          <w:color w:val="C45911" w:themeColor="accent2" w:themeShade="BF"/>
+        </w:rPr>
+        <w:t xml:space="preserve">” </w:t>
       </w:r>
       <w:r>
         <w:t xml:space="preserve">mappában vannak a főbb oldalak a </w:t>
@@ -2410,12 +2717,14 @@
       <w:r>
         <w:t>„</w:t>
       </w:r>
+      <w:proofErr w:type="spellStart"/>
       <w:r>
         <w:rPr>
           <w:color w:val="C45911" w:themeColor="accent2" w:themeShade="BF"/>
         </w:rPr>
         <w:t>pages</w:t>
       </w:r>
+      <w:proofErr w:type="spellEnd"/>
       <w:r>
         <w:rPr>
           <w:color w:val="C45911" w:themeColor="accent2" w:themeShade="BF"/>
@@ -2429,17 +2738,27 @@
         <w:t xml:space="preserve"> </w:t>
       </w:r>
       <w:r>
-        <w:t xml:space="preserve">mappában, React komponensek a </w:t>
+        <w:t xml:space="preserve">mappában, </w:t>
+      </w:r>
+      <w:proofErr w:type="spellStart"/>
+      <w:r>
+        <w:t>React</w:t>
+      </w:r>
+      <w:proofErr w:type="spellEnd"/>
+      <w:r>
+        <w:t xml:space="preserve"> komponensek a </w:t>
       </w:r>
       <w:r>
         <w:t>„</w:t>
       </w:r>
+      <w:proofErr w:type="spellStart"/>
       <w:r>
         <w:rPr>
           <w:color w:val="C45911" w:themeColor="accent2" w:themeShade="BF"/>
         </w:rPr>
         <w:t>components</w:t>
       </w:r>
+      <w:proofErr w:type="spellEnd"/>
       <w:r>
         <w:rPr>
           <w:color w:val="C45911" w:themeColor="accent2" w:themeShade="BF"/>
@@ -2458,12 +2777,14 @@
       <w:r>
         <w:t>„</w:t>
       </w:r>
+      <w:proofErr w:type="spellStart"/>
       <w:r>
         <w:rPr>
           <w:color w:val="C45911" w:themeColor="accent2" w:themeShade="BF"/>
         </w:rPr>
         <w:t>assets</w:t>
       </w:r>
+      <w:proofErr w:type="spellEnd"/>
       <w:r>
         <w:rPr>
           <w:color w:val="C45911" w:themeColor="accent2" w:themeShade="BF"/>
@@ -2495,8 +2816,13 @@
         <w:pStyle w:val="Graphlet-lvl4"/>
       </w:pPr>
       <w:bookmarkStart w:id="14" w:name="_Toc223367909"/>
-      <w:r>
-        <w:t xml:space="preserve">App.tsx és </w:t>
+      <w:proofErr w:type="spellStart"/>
+      <w:r>
+        <w:t>App.tsx</w:t>
+      </w:r>
+      <w:proofErr w:type="spellEnd"/>
+      <w:r>
+        <w:t xml:space="preserve"> és </w:t>
       </w:r>
       <w:r>
         <w:t>bejelentkezés</w:t>
@@ -2508,7 +2834,23 @@
         <w:pStyle w:val="Graphlet-normal"/>
       </w:pPr>
       <w:r>
-        <w:t>A frontend fő oldala az App.tsx, ami csak egy RouterProvider-t tartalmaz</w:t>
+        <w:t xml:space="preserve">A frontend fő oldala az </w:t>
+      </w:r>
+      <w:proofErr w:type="spellStart"/>
+      <w:r>
+        <w:t>App.tsx</w:t>
+      </w:r>
+      <w:proofErr w:type="spellEnd"/>
+      <w:r>
+        <w:t xml:space="preserve">, ami csak egy </w:t>
+      </w:r>
+      <w:proofErr w:type="spellStart"/>
+      <w:r>
+        <w:t>RouterProvider</w:t>
+      </w:r>
+      <w:proofErr w:type="spellEnd"/>
+      <w:r>
+        <w:t>-t tartalmaz</w:t>
       </w:r>
       <w:r>
         <w:t xml:space="preserve"> semmi mást</w:t>
@@ -2519,13 +2861,86 @@
       <w:r>
         <w:t xml:space="preserve"> csak az alap útvonalakat tartalmazza, és az alapján lehet navigálni.</w:t>
       </w:r>
+      <w:r>
+        <w:t xml:space="preserve"> Az útvonalak a </w:t>
+      </w:r>
+      <w:r>
+        <w:rPr>
+          <w:color w:val="C45911" w:themeColor="accent2" w:themeShade="BF"/>
+        </w:rPr>
+        <w:t>„</w:t>
+      </w:r>
+      <w:proofErr w:type="spellStart"/>
+      <w:r>
+        <w:rPr>
+          <w:color w:val="C45911" w:themeColor="accent2" w:themeShade="BF"/>
+        </w:rPr>
+        <w:t>components</w:t>
+      </w:r>
+      <w:proofErr w:type="spellEnd"/>
+      <w:r>
+        <w:rPr>
+          <w:color w:val="C45911" w:themeColor="accent2" w:themeShade="BF"/>
+        </w:rPr>
+        <w:t>/router/</w:t>
+      </w:r>
+      <w:proofErr w:type="spellStart"/>
+      <w:r>
+        <w:rPr>
+          <w:color w:val="C45911" w:themeColor="accent2" w:themeShade="BF"/>
+        </w:rPr>
+        <w:t>router.tsx</w:t>
+      </w:r>
+      <w:proofErr w:type="spellEnd"/>
+      <w:r>
+        <w:rPr>
+          <w:color w:val="C45911" w:themeColor="accent2" w:themeShade="BF"/>
+        </w:rPr>
+        <w:t xml:space="preserve">” </w:t>
+      </w:r>
+      <w:r>
+        <w:t>fájlban találhatóak. Ebbe be vannak importálva a különböző oldalak komponensei, és mindnek megva a maga elérési útvonala. Az alapútvonalra való navigáláskor automatikusan a loginra kerülünk. A beállításoknak pedig vannak leszármazott elemei</w:t>
+      </w:r>
+      <w:r>
+        <w:t>,</w:t>
+      </w:r>
+      <w:r>
+        <w:t xml:space="preserve"> amik a különböző beállítások saját oldalai. </w:t>
+      </w:r>
+      <w:r>
+        <w:t xml:space="preserve">A navigáláshoz a </w:t>
+      </w:r>
+      <w:proofErr w:type="spellStart"/>
+      <w:r>
+        <w:t>React</w:t>
+      </w:r>
+      <w:proofErr w:type="spellEnd"/>
+      <w:r>
+        <w:t xml:space="preserve"> által behozott </w:t>
+      </w:r>
+      <w:proofErr w:type="spellStart"/>
+      <w:r>
+        <w:t>Navigate</w:t>
+      </w:r>
+      <w:proofErr w:type="spellEnd"/>
+      <w:r>
+        <w:t xml:space="preserve"> elemeket használjuk. </w:t>
+      </w:r>
     </w:p>
     <w:p>
       <w:pPr>
         <w:pStyle w:val="Graphlet-normal"/>
       </w:pPr>
       <w:r>
-        <w:t xml:space="preserve">Az alap elérési útvonal „/” a login oldalra navigál. Ez a pages mappában van. Ezen az oldalon lehet bejelentkezni. </w:t>
+        <w:t xml:space="preserve">Az alap elérési útvonal „/” a login oldalra navigál. Ez a </w:t>
+      </w:r>
+      <w:proofErr w:type="spellStart"/>
+      <w:r>
+        <w:t>pages</w:t>
+      </w:r>
+      <w:proofErr w:type="spellEnd"/>
+      <w:r>
+        <w:t xml:space="preserve"> mappában van. Ezen az oldalon lehet bejelentkezni. </w:t>
       </w:r>
     </w:p>
     <w:p>
@@ -2539,7 +2954,15 @@
         <w:t>Importálás után definiálva van egy szabály az e-mail cím felépítésére. Létre vannak hozva változók, amik tárolják a bejelentkezési folyamat állapotát</w:t>
       </w:r>
       <w:r>
-        <w:t xml:space="preserve"> egy useState-ben</w:t>
+        <w:t xml:space="preserve"> egy </w:t>
+      </w:r>
+      <w:proofErr w:type="spellStart"/>
+      <w:r>
+        <w:t>useState</w:t>
+      </w:r>
+      <w:proofErr w:type="spellEnd"/>
+      <w:r>
+        <w:t>-ben</w:t>
       </w:r>
       <w:r>
         <w:t>.</w:t>
@@ -2553,8 +2976,22 @@
         <w:pStyle w:val="Graphlet-normal"/>
       </w:pPr>
       <w:r>
-        <w:t>A login funckció -nem összetévesztendő a Login-nal</w:t>
-      </w:r>
+        <w:lastRenderedPageBreak/>
+        <w:t xml:space="preserve">A login </w:t>
+      </w:r>
+      <w:proofErr w:type="spellStart"/>
+      <w:r>
+        <w:t>funckció</w:t>
+      </w:r>
+      <w:proofErr w:type="spellEnd"/>
+      <w:r>
+        <w:t xml:space="preserve"> -nem összetévesztendő a Login-</w:t>
+      </w:r>
+      <w:proofErr w:type="spellStart"/>
+      <w:r>
+        <w:t>nal</w:t>
+      </w:r>
+      <w:proofErr w:type="spellEnd"/>
       <w:r>
         <w:t>, mert az a komplett komponens</w:t>
       </w:r>
@@ -2565,7 +3002,15 @@
         <w:t>. Először megszerzi az adatokat a megfelelő helyről</w:t>
       </w:r>
       <w:r>
-        <w:t xml:space="preserve"> a css osztálynév alapján</w:t>
+        <w:t xml:space="preserve"> a </w:t>
+      </w:r>
+      <w:proofErr w:type="spellStart"/>
+      <w:r>
+        <w:t>css</w:t>
+      </w:r>
+      <w:proofErr w:type="spellEnd"/>
+      <w:r>
+        <w:t xml:space="preserve"> osztálynév alapján</w:t>
       </w:r>
       <w:r>
         <w:t>, majd ellenőrzi azokat. Utána kérést indít a backend felé</w:t>
@@ -2580,7 +3025,15 @@
         <w:t xml:space="preserve"> és a választ pedig elmenti</w:t>
       </w:r>
       <w:r>
-        <w:t>, később json formátumba ko</w:t>
+        <w:t xml:space="preserve">, később </w:t>
+      </w:r>
+      <w:proofErr w:type="spellStart"/>
+      <w:r>
+        <w:t>json</w:t>
+      </w:r>
+      <w:proofErr w:type="spellEnd"/>
+      <w:r>
+        <w:t xml:space="preserve"> formátumba ko</w:t>
       </w:r>
       <w:r>
         <w:t>n</w:t>
@@ -2600,15 +3053,27 @@
       <w:r>
         <w:t xml:space="preserve"> Amennyiben a válasz kódja 200, akkor a visszaküldött </w:t>
       </w:r>
-      <w:r>
-        <w:lastRenderedPageBreak/>
-        <w:t>tokent elmenti a böngészőbe</w:t>
+      <w:proofErr w:type="spellStart"/>
+      <w:r>
+        <w:t>tokent</w:t>
+      </w:r>
+      <w:proofErr w:type="spellEnd"/>
+      <w:r>
+        <w:t xml:space="preserve"> elmenti a böngészőbe</w:t>
       </w:r>
       <w:r>
         <w:t xml:space="preserve">, </w:t>
       </w:r>
       <w:r>
-        <w:t>és sikeresen bejelentkezünk és átkerülünk a Workspaces oldalra</w:t>
+        <w:t xml:space="preserve">és sikeresen bejelentkezünk és átkerülünk a </w:t>
+      </w:r>
+      <w:proofErr w:type="spellStart"/>
+      <w:r>
+        <w:t>Workspaces</w:t>
+      </w:r>
+      <w:proofErr w:type="spellEnd"/>
+      <w:r>
+        <w:t xml:space="preserve"> oldalra</w:t>
       </w:r>
       <w:r>
         <w:t xml:space="preserve">. </w:t>
@@ -2643,7 +3108,23 @@
         <w:t xml:space="preserve">A Login oldalról lehet idejutni. Itt lehet új felhasználói fiókot létrehozni. Kell egy e-mail cím, egy felhasználónév, és egy jelszó. </w:t>
       </w:r>
       <w:r>
-        <w:t>Itt is van e-mail cím formai ellenőrzés, hibaüzenet, amik a komponens elején beállításra kerülnek. A registerUser funkcióban a loginhoz képest még egy username is van. A bevitt értékek létezése, és formai követelményeknek való megfelelése itt is ellenőrizve van</w:t>
+        <w:t xml:space="preserve">Itt is van e-mail cím formai ellenőrzés, hibaüzenet, amik a komponens elején beállításra kerülnek. A </w:t>
+      </w:r>
+      <w:proofErr w:type="spellStart"/>
+      <w:r>
+        <w:t>registerUser</w:t>
+      </w:r>
+      <w:proofErr w:type="spellEnd"/>
+      <w:r>
+        <w:t xml:space="preserve"> funkcióban a loginhoz képest még egy </w:t>
+      </w:r>
+      <w:proofErr w:type="spellStart"/>
+      <w:r>
+        <w:t>username</w:t>
+      </w:r>
+      <w:proofErr w:type="spellEnd"/>
+      <w:r>
+        <w:t xml:space="preserve"> is van. A bevitt értékek létezése, és formai követelményeknek való megfelelése itt is ellenőrizve van</w:t>
       </w:r>
       <w:r>
         <w:t xml:space="preserve"> hasonlóképp, mint a bejelentkezésnél</w:t>
@@ -2678,8 +3159,13 @@
         <w:pStyle w:val="Graphlet-lvl4"/>
       </w:pPr>
       <w:bookmarkStart w:id="16" w:name="_Toc223367911"/>
-      <w:r>
-        <w:t>Workspaces oldal</w:t>
+      <w:proofErr w:type="spellStart"/>
+      <w:r>
+        <w:t>Workspaces</w:t>
+      </w:r>
+      <w:proofErr w:type="spellEnd"/>
+      <w:r>
+        <w:t xml:space="preserve"> oldal</w:t>
       </w:r>
       <w:bookmarkEnd w:id="16"/>
     </w:p>
@@ -2709,20 +3195,58 @@
       <w:r>
         <w:t xml:space="preserve">Az első funkció, a </w:t>
       </w:r>
+      <w:proofErr w:type="spellStart"/>
       <w:r>
         <w:t>getWorkspaces</w:t>
       </w:r>
+      <w:proofErr w:type="spellEnd"/>
       <w:r>
         <w:t xml:space="preserve"> felel azért, hogy amikor a felhasználó megnyitja az oldalt, akkor a szerverről betöltse a már létrehozott workspace-eket. </w:t>
       </w:r>
       <w:r>
-        <w:t>Egy promise-szal tér vissza, amiben egy Worspaceket tartalmazó tömb van. Kérés indul a szerverhez, és már a korábban elmentett authentikációs tokent is használja, egyrészről, hogy megbizonyosodjon a program arról, hogy a felhasználónak van-e jogosultsága, másrészről pedig, hogy azonosítani tudja a felhasználót, és a megfelelő workspace-eket adja oda neki.</w:t>
-      </w:r>
+        <w:t xml:space="preserve">Egy </w:t>
+      </w:r>
+      <w:proofErr w:type="spellStart"/>
+      <w:r>
+        <w:t>promise-szal</w:t>
+      </w:r>
+      <w:proofErr w:type="spellEnd"/>
+      <w:r>
+        <w:t xml:space="preserve"> tér vissza, amiben egy </w:t>
+      </w:r>
+      <w:proofErr w:type="spellStart"/>
+      <w:r>
+        <w:t>Worspaceket</w:t>
+      </w:r>
+      <w:proofErr w:type="spellEnd"/>
+      <w:r>
+        <w:t xml:space="preserve"> tartalmazó tömb van. Kérés indul a szerverhez, és már a korábban elmentett </w:t>
+      </w:r>
+      <w:proofErr w:type="spellStart"/>
+      <w:r>
+        <w:t>authentikációs</w:t>
+      </w:r>
+      <w:proofErr w:type="spellEnd"/>
       <w:r>
         <w:t xml:space="preserve"> </w:t>
       </w:r>
-      <w:r>
-        <w:t xml:space="preserve">Ha sikerrel tér vissza a szerver, akkor átalakítja a választ, és visszaadja a tömböt. Ha üres a tömb, akkor megjelenik egy szöveg, hogy nincs még létrehozott workspace. Hiba esetén hibaüzenet jelenik meg. </w:t>
+      <w:proofErr w:type="spellStart"/>
+      <w:r>
+        <w:t>tokent</w:t>
+      </w:r>
+      <w:proofErr w:type="spellEnd"/>
+      <w:r>
+        <w:t xml:space="preserve"> is használja, egyrészről, hogy megbizonyosodjon a program arról, hogy a felhasználónak van-e jogosultsága, másrészről pedig, hogy azonosítani tudja a felhasználót, és a megfelelő workspace-eket adja oda neki.</w:t>
+      </w:r>
+      <w:r>
+        <w:t xml:space="preserve"> </w:t>
+      </w:r>
+      <w:r>
+        <w:t xml:space="preserve">Ha sikerrel tér vissza a szerver, akkor átalakítja a választ, és </w:t>
+      </w:r>
+      <w:r>
+        <w:lastRenderedPageBreak/>
+        <w:t xml:space="preserve">visszaadja a tömböt. Ha üres a tömb, akkor megjelenik egy szöveg, hogy nincs még létrehozott workspace. Hiba esetén hibaüzenet jelenik meg. </w:t>
       </w:r>
     </w:p>
     <w:p>
@@ -2730,17 +3254,29 @@
         <w:pStyle w:val="Graphlet-normal"/>
       </w:pPr>
       <w:r>
-        <w:t xml:space="preserve">A komponens fő részében definiálva vannak értékek: maguk a workspace-k, a betöltés állapota, az aktuális hiba, az egyéb opciók megjelenési állapota, az új </w:t>
-      </w:r>
-      <w:r>
-        <w:lastRenderedPageBreak/>
-        <w:t>workspace létrehozása ablak megjelenéi állapota, a keresőmező tartalma, megnyitandó workspace url-je,</w:t>
+        <w:t xml:space="preserve">A komponens fő részében definiálva vannak értékek: maguk a workspace-k, a betöltés állapota, az aktuális hiba, az egyéb opciók megjelenési állapota, az új workspace létrehozása ablak megjelenéi állapota, a keresőmező tartalma, megnyitandó workspace </w:t>
+      </w:r>
+      <w:proofErr w:type="spellStart"/>
+      <w:r>
+        <w:t>url</w:t>
+      </w:r>
+      <w:proofErr w:type="spellEnd"/>
+      <w:r>
+        <w:t>-je,</w:t>
       </w:r>
       <w:r>
         <w:t xml:space="preserve"> </w:t>
       </w:r>
       <w:r>
-        <w:t xml:space="preserve">és az url-ben lévő beállítások, amik később kellenek. </w:t>
+        <w:t xml:space="preserve">és az </w:t>
+      </w:r>
+      <w:proofErr w:type="spellStart"/>
+      <w:r>
+        <w:t>url-ben</w:t>
+      </w:r>
+      <w:proofErr w:type="spellEnd"/>
+      <w:r>
+        <w:t xml:space="preserve"> lévő beállítások, amik később kellenek. </w:t>
       </w:r>
     </w:p>
     <w:p>
@@ -2750,14 +3286,225 @@
       <w:r>
         <w:t xml:space="preserve">A </w:t>
       </w:r>
+      <w:proofErr w:type="spellStart"/>
       <w:r>
         <w:t>loadWorkspaces</w:t>
       </w:r>
+      <w:proofErr w:type="spellEnd"/>
       <w:r>
         <w:t xml:space="preserve"> metódus betölti a szerverről lekért workspace-eket a változóba, aminek a tartalma dinamikusan jelenik meg</w:t>
       </w:r>
       <w:r>
         <w:t>.</w:t>
+      </w:r>
+      <w:r>
+        <w:t xml:space="preserve"> </w:t>
+      </w:r>
+      <w:r>
+        <w:t xml:space="preserve">A következő kisebb szekció, a </w:t>
+      </w:r>
+      <w:proofErr w:type="spellStart"/>
+      <w:r>
+        <w:t>useEffect</w:t>
+      </w:r>
+      <w:proofErr w:type="spellEnd"/>
+      <w:r>
+        <w:t xml:space="preserve"> azt a célt szolgálja, hogy amikor betölt az oldal, akkor egyből betöltse a workspace-eket. Ezután következik néhány eseménykezelő függvény</w:t>
+      </w:r>
+      <w:r>
+        <w:t>:</w:t>
+      </w:r>
+    </w:p>
+    <w:p>
+      <w:pPr>
+        <w:pStyle w:val="Graphlet-normal"/>
+      </w:pPr>
+      <w:proofErr w:type="spellStart"/>
+      <w:r>
+        <w:t>handleOtherOptionsClick</w:t>
+      </w:r>
+      <w:proofErr w:type="spellEnd"/>
+      <w:r>
+        <w:t xml:space="preserve">: </w:t>
+      </w:r>
+      <w:r>
+        <w:t>az egyéb opciók menü megjelentéséért szolgál.</w:t>
+      </w:r>
+    </w:p>
+    <w:p>
+      <w:pPr>
+        <w:pStyle w:val="Graphlet-normal"/>
+      </w:pPr>
+      <w:proofErr w:type="spellStart"/>
+      <w:r>
+        <w:t>handleCreateNewClick</w:t>
+      </w:r>
+      <w:proofErr w:type="spellEnd"/>
+      <w:r>
+        <w:t xml:space="preserve">: </w:t>
+      </w:r>
+      <w:r>
+        <w:t>a</w:t>
+      </w:r>
+      <w:r>
+        <w:t xml:space="preserve">z új workspace létrehozása </w:t>
+      </w:r>
+      <w:r>
+        <w:t>menü megjelentéséért szolgál.</w:t>
+      </w:r>
+    </w:p>
+    <w:p>
+      <w:pPr>
+        <w:pStyle w:val="Graphlet-normal"/>
+      </w:pPr>
+      <w:proofErr w:type="spellStart"/>
+      <w:r>
+        <w:t>handleCloseCreatingNew</w:t>
+      </w:r>
+      <w:proofErr w:type="spellEnd"/>
+      <w:r>
+        <w:t>:</w:t>
+      </w:r>
+      <w:r>
+        <w:t xml:space="preserve"> </w:t>
+      </w:r>
+      <w:r>
+        <w:t xml:space="preserve">az új workspace létrehozása menü </w:t>
+      </w:r>
+      <w:r>
+        <w:t>bezárásáért</w:t>
+      </w:r>
+      <w:r>
+        <w:t xml:space="preserve"> szolgál.</w:t>
+      </w:r>
+    </w:p>
+    <w:p>
+      <w:pPr>
+        <w:pStyle w:val="Graphlet-normal"/>
+      </w:pPr>
+      <w:proofErr w:type="spellStart"/>
+      <w:r>
+        <w:t>handleRename</w:t>
+      </w:r>
+      <w:proofErr w:type="spellEnd"/>
+      <w:r>
+        <w:t>: a workspace átnevezése opció megjelenítése</w:t>
+      </w:r>
+    </w:p>
+    <w:p>
+      <w:pPr>
+        <w:pStyle w:val="Graphlet-normal"/>
+      </w:pPr>
+      <w:proofErr w:type="spellStart"/>
+      <w:r>
+        <w:t>handleDelete</w:t>
+      </w:r>
+      <w:proofErr w:type="spellEnd"/>
+      <w:r>
+        <w:t>: workspace törlése opció</w:t>
+      </w:r>
+    </w:p>
+    <w:p>
+      <w:pPr>
+        <w:pStyle w:val="Graphlet-normal"/>
+      </w:pPr>
+      <w:proofErr w:type="spellStart"/>
+      <w:r>
+        <w:t>filteredWorkspaces</w:t>
+      </w:r>
+      <w:proofErr w:type="spellEnd"/>
+      <w:r>
+        <w:t xml:space="preserve">: ez egy változó, amiben a keresés </w:t>
+      </w:r>
+      <w:r>
+        <w:t xml:space="preserve">eredményi találhatóak. Ha üres, akkor szimplán nem jelenik nem semmi. </w:t>
+      </w:r>
+    </w:p>
+    <w:p>
+      <w:pPr>
+        <w:pStyle w:val="Graphlet-normal"/>
+      </w:pPr>
+      <w:proofErr w:type="spellStart"/>
+      <w:r>
+        <w:t>openWorkspaceInNewTab</w:t>
+      </w:r>
+      <w:proofErr w:type="spellEnd"/>
+      <w:r>
+        <w:t>: ha rákattintunk egy workspace-re, hogy megnyissuk, akkor ez az a függvény, ami a jó linkre visz minket, és új oldalon nyitja meg.</w:t>
+      </w:r>
+    </w:p>
+    <w:p>
+      <w:pPr>
+        <w:pStyle w:val="Graphlet-normal"/>
+      </w:pPr>
+      <w:r>
+        <w:t>Az oldalon vannak statikus részek: a felső sávban, de a workspace-ek megjelenítése és elrendezése teljesen dinamikus</w:t>
+      </w:r>
+      <w:r>
+        <w:t>, mert mindegyiknek egyedi azonosítója van</w:t>
+      </w:r>
+      <w:r>
+        <w:t xml:space="preserve">. </w:t>
+      </w:r>
+    </w:p>
+    <w:p>
+      <w:pPr>
+        <w:pStyle w:val="Graphlet-lvl4"/>
+      </w:pPr>
+      <w:proofErr w:type="spellStart"/>
+      <w:r>
+        <w:t>Other</w:t>
+      </w:r>
+      <w:proofErr w:type="spellEnd"/>
+      <w:r>
+        <w:t xml:space="preserve"> </w:t>
+      </w:r>
+      <w:proofErr w:type="spellStart"/>
+      <w:r>
+        <w:t>options</w:t>
+      </w:r>
+      <w:proofErr w:type="spellEnd"/>
+    </w:p>
+    <w:p>
+      <w:pPr>
+        <w:pStyle w:val="Graphlet-normal"/>
+      </w:pPr>
+      <w:r>
+        <w:t xml:space="preserve">Ez a komponens a </w:t>
+      </w:r>
+      <w:proofErr w:type="spellStart"/>
+      <w:r>
+        <w:t>Workspaces</w:t>
+      </w:r>
+      <w:proofErr w:type="spellEnd"/>
+      <w:r>
+        <w:t xml:space="preserve"> oldal jobb felső sarkában foglal helyet, amennyiben meg</w:t>
+      </w:r>
+      <w:r>
+        <w:t>n</w:t>
+      </w:r>
+      <w:r>
+        <w:t>yomjuk a há</w:t>
+      </w:r>
+      <w:r>
+        <w:t>r</w:t>
+      </w:r>
+      <w:r>
+        <w:t>om pontot.</w:t>
+      </w:r>
+      <w:r>
+        <w:t xml:space="preserve"> </w:t>
+      </w:r>
+      <w:r>
+        <w:t xml:space="preserve">Ez egy kicsi felugró ablak, ahonnan elérhetőek egyéb funkciók, például a kijelentkezés. A kijelentkezés gombra kattintva a program eltávolítja a böngészőből az egyedi </w:t>
+      </w:r>
+      <w:proofErr w:type="spellStart"/>
+      <w:r>
+        <w:t>tokent</w:t>
+      </w:r>
+      <w:proofErr w:type="spellEnd"/>
+      <w:r>
+        <w:t xml:space="preserve">, és visszairányít bennünket a bejelentkezés oldalra. </w:t>
       </w:r>
     </w:p>
     <w:p>
@@ -2777,6 +3524,7 @@
           <w:sz w:val="24"/>
           <w:szCs w:val="24"/>
         </w:rPr>
+        <w:lastRenderedPageBreak/>
         <w:br w:type="page"/>
       </w:r>
     </w:p>
@@ -2818,8 +3566,13 @@
       <w:pPr>
         <w:pStyle w:val="Graphlet-normal"/>
       </w:pPr>
-      <w:r>
-        <w:t>normal text</w:t>
+      <w:proofErr w:type="spellStart"/>
+      <w:r>
+        <w:t>normal</w:t>
+      </w:r>
+      <w:proofErr w:type="spellEnd"/>
+      <w:r>
+        <w:t xml:space="preserve"> text</w:t>
       </w:r>
     </w:p>
     <w:p>
@@ -2896,7 +3649,39 @@
         <w:pStyle w:val="Graphlet-normal"/>
       </w:pPr>
       <w:r>
-        <w:t>projekt célja, milyen problémára dott mergoldást, techológia, megoldáaok, sikerült-e, működik-e, követelmények teljesülte-e? tapasztalatok…</w:t>
+        <w:t xml:space="preserve">projekt célja, milyen problémára </w:t>
+      </w:r>
+      <w:proofErr w:type="spellStart"/>
+      <w:r>
+        <w:t>dott</w:t>
+      </w:r>
+      <w:proofErr w:type="spellEnd"/>
+      <w:r>
+        <w:t xml:space="preserve"> </w:t>
+      </w:r>
+      <w:proofErr w:type="spellStart"/>
+      <w:r>
+        <w:t>mergoldást</w:t>
+      </w:r>
+      <w:proofErr w:type="spellEnd"/>
+      <w:r>
+        <w:t xml:space="preserve">, </w:t>
+      </w:r>
+      <w:proofErr w:type="spellStart"/>
+      <w:r>
+        <w:t>techológia</w:t>
+      </w:r>
+      <w:proofErr w:type="spellEnd"/>
+      <w:r>
+        <w:t xml:space="preserve">, </w:t>
+      </w:r>
+      <w:proofErr w:type="spellStart"/>
+      <w:r>
+        <w:t>megoldáaok</w:t>
+      </w:r>
+      <w:proofErr w:type="spellEnd"/>
+      <w:r>
+        <w:t>, sikerült-e, működik-e, követelmények teljesülte-e? tapasztalatok…</w:t>
       </w:r>
     </w:p>
     <w:p>

</xml_diff>